<commit_message>
Handoff kit: add 'materials to send' ask + asset-intake tracker tab
Yael has more materials/assets to share. Add an 'Anything you've already got?'
section to the email (html/md/docx) listing the useful items, and a new
'Assets to gather' sheet in the tracker mapping each asset to where it lands on
the site (covers auto-drop into assets/covers/<slug>.jpg, ebook files → Payhip,
photo/bio → About, etc.) with a Received? dropdown.
</commit_message>
<xml_diff>
--- a/handoff/email-to-yael.docx
+++ b/handoff/email-to-yael.docx
@@ -298,6 +298,111 @@
           <w:sz w:val="22"/>
         </w:rPr>
         <w:t>Do the same for the second book, and send me both links. I'll paste them in and your buttons go live.</w:t>
+      </w:r>
+    </w:p>
+    <w:p>
+      <w:pPr>
+        <w:spacing w:before="280" w:after="80"/>
+      </w:pPr>
+      <w:r>
+        <w:rPr>
+          <w:b/>
+          <w:color w:val="1B291F"/>
+          <w:sz w:val="28"/>
+        </w:rPr>
+        <w:t>◈  Anything you've already got? Send it my way</w:t>
+      </w:r>
+    </w:p>
+    <w:p>
+      <w:pPr>
+        <w:spacing w:after="80"/>
+      </w:pPr>
+      <w:r>
+        <w:rPr>
+          <w:b w:val="0"/>
+          <w:i w:val="0"/>
+          <w:color w:val="2F4538"/>
+          <w:sz w:val="22"/>
+        </w:rPr>
+        <w:t>You mentioned you have other materials — wonderful, that's exactly what fills the site out. If you have any of these, send what you've got and I'll slot them in cleanly (don't worry about sizing or formatting):</w:t>
+      </w:r>
+    </w:p>
+    <w:p>
+      <w:pPr>
+        <w:pStyle w:val="ListBullet"/>
+        <w:spacing w:after="60"/>
+      </w:pPr>
+      <w:r>
+        <w:rPr>
+          <w:color w:val="2F4538"/>
+          <w:sz w:val="22"/>
+        </w:rPr>
+        <w:t>The ebook files (PDF or EPUB) — these are what Payhip sells and delivers</w:t>
+      </w:r>
+    </w:p>
+    <w:p>
+      <w:pPr>
+        <w:pStyle w:val="ListBullet"/>
+        <w:spacing w:after="60"/>
+      </w:pPr>
+      <w:r>
+        <w:rPr>
+          <w:color w:val="2F4538"/>
+          <w:sz w:val="22"/>
+        </w:rPr>
+        <w:t>Cover art for each book — I'll place it and it appears automatically</w:t>
+      </w:r>
+    </w:p>
+    <w:p>
+      <w:pPr>
+        <w:pStyle w:val="ListBullet"/>
+        <w:spacing w:after="60"/>
+      </w:pPr>
+      <w:r>
+        <w:rPr>
+          <w:color w:val="2F4538"/>
+          <w:sz w:val="22"/>
+        </w:rPr>
+        <w:t>A short blurb for each book (a paragraph) and the prices</w:t>
+      </w:r>
+    </w:p>
+    <w:p>
+      <w:pPr>
+        <w:pStyle w:val="ListBullet"/>
+        <w:spacing w:after="60"/>
+      </w:pPr>
+      <w:r>
+        <w:rPr>
+          <w:color w:val="2F4538"/>
+          <w:sz w:val="22"/>
+        </w:rPr>
+        <w:t>A photo of you and a few lines of bio — for the About page</w:t>
+      </w:r>
+    </w:p>
+    <w:p>
+      <w:pPr>
+        <w:pStyle w:val="ListBullet"/>
+        <w:spacing w:after="60"/>
+      </w:pPr>
+      <w:r>
+        <w:rPr>
+          <w:color w:val="2F4538"/>
+          <w:sz w:val="22"/>
+        </w:rPr>
+        <w:t>Any reader notes or endorsements you'd like to feature</w:t>
+      </w:r>
+    </w:p>
+    <w:p>
+      <w:pPr>
+        <w:pStyle w:val="ListBullet"/>
+        <w:spacing w:after="60"/>
+      </w:pPr>
+      <w:r>
+        <w:rPr>
+          <w:color w:val="2F4538"/>
+          <w:sz w:val="22"/>
+        </w:rPr>
+        <w:t>A logo, and your Facebook / contact links</w:t>
       </w:r>
     </w:p>
     <w:p>

</xml_diff>